<commit_message>
reajustimement de la taille des images
</commit_message>
<xml_diff>
--- a/resume_git_github (Récupération automatique).docx
+++ b/resume_git_github (Récupération automatique).docx
@@ -30,15 +30,7 @@
         <w:ind w:left="-5"/>
       </w:pPr>
       <w:r>
-        <w:t xml:space="preserve">   </w:t>
-      </w:r>
-      <w:proofErr w:type="gramStart"/>
-      <w:r>
-        <w:t>git</w:t>
-      </w:r>
-      <w:proofErr w:type="gramEnd"/>
-      <w:r>
-        <w:t xml:space="preserve"> init</w:t>
+        <w:t xml:space="preserve">   git init</w:t>
       </w:r>
     </w:p>
     <w:p>
@@ -51,18 +43,8 @@
         <w:ind w:right="1038" w:hanging="267"/>
       </w:pPr>
       <w:r>
-        <w:t xml:space="preserve">Ajouter tous les fichiers au suivi Git :    git </w:t>
-      </w:r>
-      <w:proofErr w:type="spellStart"/>
-      <w:proofErr w:type="gramStart"/>
-      <w:r>
-        <w:t>add</w:t>
-      </w:r>
-      <w:proofErr w:type="spellEnd"/>
-      <w:r>
-        <w:t xml:space="preserve"> .</w:t>
-      </w:r>
-      <w:proofErr w:type="gramEnd"/>
+        <w:t>Ajouter tous les fichiers au suivi Git :    git add .</w:t>
+      </w:r>
     </w:p>
     <w:p>
       <w:pPr>
@@ -87,45 +69,8 @@
         <w:ind w:right="1038" w:hanging="267"/>
       </w:pPr>
       <w:r>
-        <w:t>Ajouter le dépôt distant (</w:t>
-      </w:r>
-      <w:proofErr w:type="spellStart"/>
-      <w:r>
-        <w:t>origin</w:t>
-      </w:r>
-      <w:proofErr w:type="spellEnd"/>
-      <w:r>
-        <w:t xml:space="preserve">) :    git </w:t>
-      </w:r>
-      <w:proofErr w:type="spellStart"/>
-      <w:r>
-        <w:t>remote</w:t>
-      </w:r>
-      <w:proofErr w:type="spellEnd"/>
-      <w:r>
-        <w:t xml:space="preserve"> </w:t>
-      </w:r>
-      <w:proofErr w:type="spellStart"/>
-      <w:r>
-        <w:t>add</w:t>
-      </w:r>
-      <w:proofErr w:type="spellEnd"/>
-      <w:r>
-        <w:t xml:space="preserve"> </w:t>
-      </w:r>
-      <w:proofErr w:type="spellStart"/>
-      <w:r>
-        <w:t>origin</w:t>
-      </w:r>
-      <w:proofErr w:type="spellEnd"/>
-      <w:r>
-        <w:t xml:space="preserve"> https://github.com/&lt;ton-utilisateur&gt;/&lt;nom-du-depot</w:t>
-      </w:r>
-      <w:proofErr w:type="gramStart"/>
-      <w:r>
-        <w:t>&gt;.git</w:t>
-      </w:r>
-      <w:proofErr w:type="gramEnd"/>
+        <w:t>Ajouter le dépôt distant (origin) :    git remote add origin https://github.com/&lt;ton-utilisateur&gt;/&lt;nom-du-depot&gt;.git</w:t>
+      </w:r>
     </w:p>
     <w:p>
       <w:pPr>
@@ -137,17 +82,7 @@
         <w:ind w:right="1038" w:hanging="267"/>
       </w:pPr>
       <w:r>
-        <w:t xml:space="preserve">Augmenter la taille du buffer pour éviter l'erreur de timeout :    git config --global </w:t>
-      </w:r>
-      <w:proofErr w:type="spellStart"/>
-      <w:proofErr w:type="gramStart"/>
-      <w:r>
-        <w:t>http.postBuffer</w:t>
-      </w:r>
-      <w:proofErr w:type="spellEnd"/>
-      <w:proofErr w:type="gramEnd"/>
-      <w:r>
-        <w:t xml:space="preserve"> 1048576000</w:t>
+        <w:t>Augmenter la taille du buffer pour éviter l'erreur de timeout :    git config --global http.postBuffer 1048576000</w:t>
       </w:r>
     </w:p>
     <w:p>
@@ -160,23 +95,7 @@
         <w:ind w:right="1038" w:hanging="267"/>
       </w:pPr>
       <w:r>
-        <w:t>Pousser la branche master et créer la liaison avec le dépôt distant :    git push --set-</w:t>
-      </w:r>
-      <w:proofErr w:type="spellStart"/>
-      <w:r>
-        <w:t>upstream</w:t>
-      </w:r>
-      <w:proofErr w:type="spellEnd"/>
-      <w:r>
-        <w:t xml:space="preserve"> </w:t>
-      </w:r>
-      <w:proofErr w:type="spellStart"/>
-      <w:r>
-        <w:t>origin</w:t>
-      </w:r>
-      <w:proofErr w:type="spellEnd"/>
-      <w:r>
-        <w:t xml:space="preserve"> master</w:t>
+        <w:t>Pousser la branche master et créer la liaison avec le dépôt distant :    git push --set-upstream origin master</w:t>
       </w:r>
     </w:p>
     <w:p>
@@ -198,39 +117,7 @@
         <w:ind w:hanging="147"/>
       </w:pPr>
       <w:r>
-        <w:t>Si '</w:t>
-      </w:r>
-      <w:proofErr w:type="spellStart"/>
-      <w:r>
-        <w:t>remote</w:t>
-      </w:r>
-      <w:proofErr w:type="spellEnd"/>
-      <w:r>
-        <w:t xml:space="preserve"> </w:t>
-      </w:r>
-      <w:proofErr w:type="spellStart"/>
-      <w:r>
-        <w:t>origin</w:t>
-      </w:r>
-      <w:proofErr w:type="spellEnd"/>
-      <w:r>
-        <w:t xml:space="preserve"> </w:t>
-      </w:r>
-      <w:proofErr w:type="spellStart"/>
-      <w:r>
-        <w:t>already</w:t>
-      </w:r>
-      <w:proofErr w:type="spellEnd"/>
-      <w:r>
-        <w:t xml:space="preserve"> </w:t>
-      </w:r>
-      <w:proofErr w:type="spellStart"/>
-      <w:r>
-        <w:t>exists</w:t>
-      </w:r>
-      <w:proofErr w:type="spellEnd"/>
-      <w:r>
-        <w:t>' :</w:t>
+        <w:t>Si 'remote origin already exists' :</w:t>
       </w:r>
     </w:p>
     <w:p>
@@ -239,69 +126,35 @@
         <w:ind w:left="-5"/>
       </w:pPr>
       <w:r>
-        <w:t xml:space="preserve">   </w:t>
-      </w:r>
-      <w:proofErr w:type="gramStart"/>
-      <w:r>
-        <w:t>git</w:t>
-      </w:r>
-      <w:proofErr w:type="gramEnd"/>
-      <w:r>
-        <w:t xml:space="preserve"> </w:t>
-      </w:r>
-      <w:proofErr w:type="spellStart"/>
-      <w:r>
-        <w:t>remote</w:t>
-      </w:r>
-      <w:proofErr w:type="spellEnd"/>
-      <w:r>
-        <w:t xml:space="preserve"> </w:t>
-      </w:r>
-      <w:proofErr w:type="spellStart"/>
-      <w:r>
-        <w:t>remove</w:t>
-      </w:r>
-      <w:proofErr w:type="spellEnd"/>
-      <w:r>
-        <w:t xml:space="preserve"> </w:t>
-      </w:r>
-      <w:proofErr w:type="spellStart"/>
-      <w:r>
-        <w:t>origin</w:t>
-      </w:r>
-      <w:proofErr w:type="spellEnd"/>
-      <w:r>
-        <w:t xml:space="preserve">    git </w:t>
-      </w:r>
-      <w:proofErr w:type="spellStart"/>
-      <w:r>
-        <w:t>remote</w:t>
-      </w:r>
-      <w:proofErr w:type="spellEnd"/>
-      <w:r>
-        <w:t xml:space="preserve"> </w:t>
-      </w:r>
-      <w:proofErr w:type="spellStart"/>
-      <w:r>
-        <w:t>add</w:t>
-      </w:r>
-      <w:proofErr w:type="spellEnd"/>
-      <w:r>
-        <w:t xml:space="preserve"> </w:t>
-      </w:r>
-      <w:proofErr w:type="spellStart"/>
-      <w:r>
-        <w:t>origin</w:t>
-      </w:r>
-      <w:proofErr w:type="spellEnd"/>
-      <w:r>
-        <w:t xml:space="preserve"> https://github.com/&lt;ton-utilisateur&gt;/&lt;nom-du-depot</w:t>
-      </w:r>
-      <w:proofErr w:type="gramStart"/>
-      <w:r>
-        <w:t>&gt;.git</w:t>
-      </w:r>
-      <w:proofErr w:type="gramEnd"/>
+        <w:t xml:space="preserve">   git remote remove origin    git remote add origin </w:t>
+      </w:r>
+      <w:hyperlink r:id="rId5" w:history="1">
+        <w:r>
+          <w:rPr>
+            <w:rStyle w:val="Lienhypertexte"/>
+          </w:rPr>
+          <w:t>https://github.com/&lt;ton-utilisateur&gt;/&lt;nom-du-depot&gt;.git</w:t>
+        </w:r>
+      </w:hyperlink>
+    </w:p>
+    <w:p>
+      <w:pPr>
+        <w:spacing w:line="493" w:lineRule="auto"/>
+        <w:ind w:left="-5"/>
+      </w:pPr>
+      <w:r>
+        <w:t>pour faire revenire le code, il faut le pull</w:t>
+      </w:r>
+    </w:p>
+    <w:p>
+      <w:pPr>
+        <w:spacing w:line="493" w:lineRule="auto"/>
+        <w:ind w:left="-5"/>
+      </w:pPr>
+      <w:r>
+        <w:lastRenderedPageBreak/>
+        <w:t>git pull origin master</w:t>
+      </w:r>
     </w:p>
     <w:p>
       <w:pPr>
@@ -312,23 +165,7 @@
         <w:ind w:hanging="147"/>
       </w:pPr>
       <w:r>
-        <w:t xml:space="preserve">Si 'Permission </w:t>
-      </w:r>
-      <w:proofErr w:type="spellStart"/>
-      <w:r>
-        <w:t>denied</w:t>
-      </w:r>
-      <w:proofErr w:type="spellEnd"/>
-      <w:r>
-        <w:t xml:space="preserve"> (</w:t>
-      </w:r>
-      <w:proofErr w:type="spellStart"/>
-      <w:r>
-        <w:t>publickey</w:t>
-      </w:r>
-      <w:proofErr w:type="spellEnd"/>
-      <w:r>
-        <w:t>)' :</w:t>
+        <w:t>Si 'Permission denied (publickey)' :</w:t>
       </w:r>
     </w:p>
     <w:p>
@@ -346,7 +183,6 @@
         <w:ind w:left="-5"/>
       </w:pPr>
       <w:r>
-        <w:lastRenderedPageBreak/>
         <w:t>Vérifier que tout est OK :</w:t>
       </w:r>
     </w:p>
@@ -363,7 +199,7 @@
       <w:pPr>
         <w:ind w:left="-5"/>
       </w:pPr>
-      <w:hyperlink r:id="rId5" w:history="1">
+      <w:hyperlink r:id="rId6" w:history="1">
         <w:r>
           <w:rPr>
             <w:rStyle w:val="Lienhypertexte"/>
@@ -382,43 +218,23 @@
         <w:ind w:left="-5"/>
       </w:pPr>
       <w:r>
-        <w:t xml:space="preserve">Pour ajouter le fichier qui comporte </w:t>
-      </w:r>
-      <w:proofErr w:type="gramStart"/>
-      <w:r>
-        <w:t>des bibliothèque</w:t>
-      </w:r>
-      <w:proofErr w:type="gramEnd"/>
-      <w:r>
-        <w:t xml:space="preserve"> à mon ami, il faut</w:t>
-      </w:r>
-    </w:p>
-    <w:p>
-      <w:pPr>
-        <w:ind w:left="-5"/>
-      </w:pPr>
-      <w:proofErr w:type="gramStart"/>
-      <w:r>
-        <w:t>  Ouvre</w:t>
-      </w:r>
-      <w:proofErr w:type="gramEnd"/>
-      <w:r>
-        <w:t xml:space="preserve"> ton terminal dans ton projet, puis exécute :</w:t>
+        <w:t>Pour ajouter le fichier qui comporte des bibliothèque à mon ami, il faut</w:t>
+      </w:r>
+    </w:p>
+    <w:p>
+      <w:pPr>
+        <w:ind w:left="-5"/>
+      </w:pPr>
+      <w:r>
+        <w:t>  Ouvre ton terminal dans ton projet, puis exécute :</w:t>
       </w:r>
     </w:p>
     <w:p>
       <w:pPr>
         <w:ind w:left="0" w:firstLine="0"/>
       </w:pPr>
-      <w:proofErr w:type="spellStart"/>
-      <w:proofErr w:type="gramStart"/>
-      <w:r>
-        <w:t>pip</w:t>
-      </w:r>
-      <w:proofErr w:type="spellEnd"/>
-      <w:proofErr w:type="gramEnd"/>
-      <w:r>
-        <w:t xml:space="preserve"> freeze &gt; requirements.txt</w:t>
+      <w:r>
+        <w:t>pip freeze &gt; requirements.txt</w:t>
       </w:r>
     </w:p>
     <w:p>
@@ -443,7 +259,6 @@
       <w:pPr>
         <w:ind w:left="-5"/>
       </w:pPr>
-      <w:proofErr w:type="gramStart"/>
       <w:r>
         <w:t xml:space="preserve">  </w:t>
       </w:r>
@@ -452,193 +267,101 @@
           <w:b/>
           <w:bCs/>
         </w:rPr>
-        <w:t>Vérifie</w:t>
-      </w:r>
-      <w:proofErr w:type="gramEnd"/>
+        <w:t>Vérifie qu’il a bien été créé</w:t>
+      </w:r>
+      <w:r>
+        <w:t xml:space="preserve"> :</w:t>
+      </w:r>
+      <w:r>
+        <w:br/>
+        <w:t>Tu peux exécuter :</w:t>
+      </w:r>
+    </w:p>
+    <w:p>
+      <w:pPr>
+        <w:ind w:left="0" w:firstLine="0"/>
+      </w:pPr>
+      <w:r>
+        <w:t>dir requirements.txt</w:t>
+      </w:r>
+    </w:p>
+    <w:p>
+      <w:pPr>
+        <w:ind w:left="-5"/>
+      </w:pPr>
+      <w:r>
+        <w:t>Si tu vois le fichier listé, c’est bon.</w:t>
+      </w:r>
+    </w:p>
+    <w:p>
+      <w:pPr>
+        <w:ind w:left="-5"/>
+      </w:pPr>
+      <w:r>
+        <w:t xml:space="preserve">  </w:t>
+      </w:r>
       <w:r>
         <w:rPr>
           <w:b/>
           <w:bCs/>
         </w:rPr>
-        <w:t xml:space="preserve"> qu’il a bien été créé</w:t>
+        <w:t>Ajoute-le à Git</w:t>
       </w:r>
       <w:r>
         <w:t xml:space="preserve"> :</w:t>
       </w:r>
-      <w:r>
-        <w:br/>
-        <w:t>Tu peux exécuter :</w:t>
-      </w:r>
     </w:p>
     <w:p>
       <w:pPr>
         <w:ind w:left="0" w:firstLine="0"/>
       </w:pPr>
-      <w:proofErr w:type="spellStart"/>
-      <w:proofErr w:type="gramStart"/>
-      <w:r>
-        <w:t>dir</w:t>
-      </w:r>
-      <w:proofErr w:type="spellEnd"/>
-      <w:proofErr w:type="gramEnd"/>
-      <w:r>
-        <w:t xml:space="preserve"> requirements.txt</w:t>
-      </w:r>
-    </w:p>
-    <w:p>
-      <w:pPr>
-        <w:ind w:left="-5"/>
-      </w:pPr>
-      <w:r>
-        <w:t>Si tu vois le fichier listé, c’est bon.</w:t>
-      </w:r>
-    </w:p>
-    <w:p>
-      <w:pPr>
-        <w:ind w:left="-5"/>
-      </w:pPr>
-      <w:proofErr w:type="gramStart"/>
-      <w:r>
-        <w:t xml:space="preserve">  </w:t>
-      </w:r>
-      <w:r>
-        <w:rPr>
-          <w:b/>
-          <w:bCs/>
-        </w:rPr>
-        <w:t>Ajoute</w:t>
-      </w:r>
-      <w:proofErr w:type="gramEnd"/>
-      <w:r>
-        <w:rPr>
-          <w:b/>
-          <w:bCs/>
-        </w:rPr>
-        <w:t>-le à Git</w:t>
-      </w:r>
-      <w:r>
-        <w:t xml:space="preserve"> :</w:t>
-      </w:r>
-    </w:p>
-    <w:p>
-      <w:pPr>
-        <w:ind w:left="0" w:firstLine="0"/>
-      </w:pPr>
-      <w:proofErr w:type="gramStart"/>
-      <w:r>
-        <w:t>git</w:t>
-      </w:r>
-      <w:proofErr w:type="gramEnd"/>
+      <w:r>
+        <w:t>git add requirements.txt</w:t>
+      </w:r>
+    </w:p>
+    <w:p>
+      <w:pPr>
+        <w:ind w:left="-5"/>
+      </w:pPr>
+      <w:r>
+        <w:lastRenderedPageBreak/>
+        <w:t>git commit -m "Ajout des dépendances avec pip freeze"</w:t>
+      </w:r>
+    </w:p>
+    <w:p>
+      <w:pPr>
+        <w:ind w:left="-5"/>
+      </w:pPr>
+      <w:r>
+        <w:t>git push origin master</w:t>
+      </w:r>
+    </w:p>
+    <w:p>
+      <w:pPr>
+        <w:ind w:left="-5"/>
+      </w:pPr>
+      <w:r>
+        <w:t xml:space="preserve">Pour créer une sauvegarde de la base de données, il faut </w:t>
+      </w:r>
+    </w:p>
+    <w:p>
+      <w:pPr>
+        <w:ind w:left="-5"/>
+      </w:pPr>
+      <w:r>
+        <w:t>pg_dump -U postgres -h localhost -p 5432 -F c -b -v -f</w:t>
+      </w:r>
       <w:r>
         <w:t xml:space="preserve"> </w:t>
       </w:r>
-      <w:proofErr w:type="spellStart"/>
-      <w:r>
-        <w:t>add</w:t>
-      </w:r>
-      <w:proofErr w:type="spellEnd"/>
-      <w:r>
-        <w:t xml:space="preserve"> requirements.txt</w:t>
-      </w:r>
-    </w:p>
-    <w:p>
-      <w:pPr>
-        <w:ind w:left="-5"/>
-      </w:pPr>
-      <w:proofErr w:type="gramStart"/>
-      <w:r>
-        <w:t>git</w:t>
-      </w:r>
-      <w:proofErr w:type="gramEnd"/>
-      <w:r>
-        <w:t xml:space="preserve"> commit -m "Ajout des dépendances avec </w:t>
-      </w:r>
-      <w:proofErr w:type="spellStart"/>
-      <w:r>
-        <w:t>pip</w:t>
-      </w:r>
-      <w:proofErr w:type="spellEnd"/>
-      <w:r>
-        <w:t xml:space="preserve"> freeze"</w:t>
-      </w:r>
-    </w:p>
-    <w:p>
-      <w:pPr>
-        <w:ind w:left="-5"/>
-      </w:pPr>
-      <w:proofErr w:type="gramStart"/>
-      <w:r>
-        <w:t>git</w:t>
-      </w:r>
-      <w:proofErr w:type="gramEnd"/>
-      <w:r>
-        <w:t xml:space="preserve"> push </w:t>
-      </w:r>
-      <w:proofErr w:type="spellStart"/>
-      <w:r>
-        <w:t>origin</w:t>
-      </w:r>
-      <w:proofErr w:type="spellEnd"/>
-      <w:r>
-        <w:t xml:space="preserve"> master</w:t>
-      </w:r>
-    </w:p>
-    <w:p>
-      <w:pPr>
-        <w:ind w:left="-5"/>
-      </w:pPr>
-      <w:r>
-        <w:t xml:space="preserve">Pour créer une sauvegarde de la base de données, il faut </w:t>
-      </w:r>
-    </w:p>
-    <w:p>
-      <w:pPr>
-        <w:ind w:left="-5"/>
-      </w:pPr>
-      <w:proofErr w:type="spellStart"/>
-      <w:proofErr w:type="gramStart"/>
-      <w:r>
-        <w:t>pg</w:t>
-      </w:r>
-      <w:proofErr w:type="gramEnd"/>
-      <w:r>
-        <w:t>_dump</w:t>
-      </w:r>
-      <w:proofErr w:type="spellEnd"/>
-      <w:r>
-        <w:t xml:space="preserve"> -U </w:t>
-      </w:r>
-      <w:proofErr w:type="spellStart"/>
-      <w:r>
-        <w:t>postgres</w:t>
-      </w:r>
-      <w:proofErr w:type="spellEnd"/>
-      <w:r>
-        <w:t xml:space="preserve"> -h localhost -p 5432 -F c -b -v -f</w:t>
-      </w:r>
-      <w:r>
-        <w:t xml:space="preserve"> </w:t>
-      </w:r>
-      <w:proofErr w:type="spellStart"/>
-      <w:r>
-        <w:t>geoimmo_</w:t>
-      </w:r>
-      <w:proofErr w:type="gramStart"/>
-      <w:r>
-        <w:t>backup.dump</w:t>
-      </w:r>
-      <w:proofErr w:type="spellEnd"/>
-      <w:proofErr w:type="gramEnd"/>
-      <w:r>
-        <w:t xml:space="preserve"> </w:t>
+      <w:r>
+        <w:t xml:space="preserve">geoimmo_backup.dump </w:t>
       </w:r>
       <w:commentRangeStart w:id="0"/>
-      <w:proofErr w:type="spellStart"/>
       <w:r>
         <w:t>geoimmo_db</w:t>
       </w:r>
       <w:commentRangeEnd w:id="0"/>
-      <w:proofErr w:type="spellEnd"/>
       <w:r>
         <w:rPr>
           <w:rStyle w:val="Marquedecommentaire"/>
@@ -651,7 +374,6 @@
         <w:ind w:left="-5"/>
       </w:pPr>
       <w:r>
-        <w:lastRenderedPageBreak/>
         <w:t xml:space="preserve">Pour </w:t>
       </w:r>
       <w:r>
@@ -665,94 +387,38 @@
       <w:pPr>
         <w:ind w:left="-5"/>
       </w:pPr>
-      <w:proofErr w:type="spellStart"/>
-      <w:proofErr w:type="gramStart"/>
-      <w:r>
-        <w:t>pg</w:t>
-      </w:r>
-      <w:proofErr w:type="gramEnd"/>
-      <w:r>
-        <w:t>_restore</w:t>
-      </w:r>
-      <w:proofErr w:type="spellEnd"/>
-      <w:r>
-        <w:t xml:space="preserve"> -U </w:t>
-      </w:r>
-      <w:proofErr w:type="spellStart"/>
-      <w:r>
-        <w:t>postgres</w:t>
-      </w:r>
-      <w:proofErr w:type="spellEnd"/>
-      <w:r>
-        <w:t xml:space="preserve"> -h localhost -p 5432 -d </w:t>
-      </w:r>
-      <w:proofErr w:type="spellStart"/>
-      <w:r>
-        <w:t>dccf_tes</w:t>
-      </w:r>
-      <w:proofErr w:type="spellEnd"/>
-      <w:r>
-        <w:t xml:space="preserve"> -v </w:t>
-      </w:r>
-      <w:proofErr w:type="spellStart"/>
-      <w:proofErr w:type="gramStart"/>
-      <w:r>
-        <w:t>geoportail.dump</w:t>
-      </w:r>
-      <w:proofErr w:type="spellEnd"/>
-      <w:proofErr w:type="gramEnd"/>
-    </w:p>
-    <w:p>
-      <w:pPr>
-        <w:ind w:left="-5"/>
-      </w:pPr>
-      <w:proofErr w:type="gramStart"/>
-      <w:r>
-        <w:t>pour</w:t>
-      </w:r>
-      <w:proofErr w:type="gramEnd"/>
-      <w:r>
-        <w:t xml:space="preserve"> </w:t>
+      <w:r>
+        <w:t>pg_restore -U postgres -h localhost -p 5432 -d dccf_tes -v geoportail.dump</w:t>
+      </w:r>
+    </w:p>
+    <w:p>
+      <w:pPr>
+        <w:ind w:left="-5"/>
+      </w:pPr>
+      <w:r>
+        <w:t xml:space="preserve">pour </w:t>
       </w:r>
       <w:r>
         <w:t>redémarrer</w:t>
       </w:r>
       <w:r>
-        <w:t xml:space="preserve"> le serveur </w:t>
-      </w:r>
-      <w:proofErr w:type="spellStart"/>
-      <w:r>
-        <w:t>postgres</w:t>
-      </w:r>
-      <w:proofErr w:type="spellEnd"/>
-      <w:r>
-        <w:t xml:space="preserve"> </w:t>
-      </w:r>
-    </w:p>
-    <w:p>
-      <w:pPr>
-        <w:ind w:left="-5"/>
-      </w:pPr>
-      <w:proofErr w:type="gramStart"/>
-      <w:r>
-        <w:t>net</w:t>
-      </w:r>
-      <w:proofErr w:type="gramEnd"/>
-      <w:r>
-        <w:t xml:space="preserve"> stop postgresql-x64-15</w:t>
-      </w:r>
-    </w:p>
-    <w:p>
-      <w:pPr>
-        <w:ind w:left="-5"/>
-      </w:pPr>
-      <w:proofErr w:type="gramStart"/>
-      <w:r>
-        <w:t>net</w:t>
-      </w:r>
-      <w:proofErr w:type="gramEnd"/>
-      <w:r>
-        <w:t xml:space="preserve"> start postgresql-x64-15</w:t>
+        <w:t xml:space="preserve"> le serveur postgres </w:t>
+      </w:r>
+    </w:p>
+    <w:p>
+      <w:pPr>
+        <w:ind w:left="-5"/>
+      </w:pPr>
+      <w:r>
+        <w:t>net stop postgresql-x64-15</w:t>
+      </w:r>
+    </w:p>
+    <w:p>
+      <w:pPr>
+        <w:ind w:left="-5"/>
+      </w:pPr>
+      <w:r>
+        <w:t>net start postgresql-x64-15</w:t>
       </w:r>
     </w:p>
     <w:p>
@@ -767,11 +433,9 @@
       <w:pPr>
         <w:ind w:left="-5"/>
       </w:pPr>
-      <w:proofErr w:type="spellStart"/>
       <w:r>
         <w:t>wf.msc</w:t>
       </w:r>
-      <w:proofErr w:type="spellEnd"/>
     </w:p>
     <w:p>
       <w:pPr>
@@ -869,19 +533,16 @@
       <w:pPr>
         <w:ind w:left="-5"/>
       </w:pPr>
-      <w:proofErr w:type="spellStart"/>
-      <w:proofErr w:type="gramStart"/>
       <w:r>
         <w:t>yaml</w:t>
       </w:r>
-      <w:proofErr w:type="spellEnd"/>
-      <w:proofErr w:type="gramEnd"/>
-    </w:p>
-    <w:p>
-      <w:pPr>
-        <w:ind w:left="-5"/>
-      </w:pPr>
-      <w:r>
+    </w:p>
+    <w:p>
+      <w:pPr>
+        <w:ind w:left="-5"/>
+      </w:pPr>
+      <w:r>
+        <w:lastRenderedPageBreak/>
         <w:t>PostgreSQL - Port 5432</w:t>
       </w:r>
     </w:p>
@@ -2401,6 +2062,7 @@
   <w:style w:type="character" w:default="1" w:styleId="Policepardfaut">
     <w:name w:val="Default Paragraph Font"/>
     <w:uiPriority w:val="1"/>
+    <w:semiHidden/>
     <w:unhideWhenUsed/>
   </w:style>
   <w:style w:type="table" w:default="1" w:styleId="TableauNormal">

</xml_diff>

<commit_message>
Ajout des option de partage d'annonce
</commit_message>
<xml_diff>
--- a/resume_git_github (Récupération automatique).docx
+++ b/resume_git_github (Récupération automatique).docx
@@ -35,6 +35,39 @@
     </w:p>
     <w:p>
       <w:pPr>
+        <w:spacing w:after="830"/>
+        <w:ind w:left="-5"/>
+      </w:pPr>
+      <w:r>
+        <w:t xml:space="preserve">git </w:t>
+      </w:r>
+      <w:proofErr w:type="spellStart"/>
+      <w:r>
+        <w:t>remote</w:t>
+      </w:r>
+      <w:proofErr w:type="spellEnd"/>
+      <w:r>
+        <w:t xml:space="preserve"> </w:t>
+      </w:r>
+      <w:proofErr w:type="spellStart"/>
+      <w:r>
+        <w:t>add</w:t>
+      </w:r>
+      <w:proofErr w:type="spellEnd"/>
+      <w:r>
+        <w:t xml:space="preserve"> </w:t>
+      </w:r>
+      <w:proofErr w:type="spellStart"/>
+      <w:r>
+        <w:t>origin</w:t>
+      </w:r>
+      <w:proofErr w:type="spellEnd"/>
+      <w:r>
+        <w:t xml:space="preserve"> https://github.com/1998Jules/cadastre_togo.git</w:t>
+      </w:r>
+    </w:p>
+    <w:p>
+      <w:pPr>
         <w:numPr>
           <w:ilvl w:val="0"/>
           <w:numId w:val="1"/>
@@ -43,7 +76,15 @@
         <w:ind w:right="1038" w:hanging="267"/>
       </w:pPr>
       <w:r>
-        <w:t>Ajouter tous les fichiers au suivi Git :    git add .</w:t>
+        <w:t xml:space="preserve">Ajouter tous les fichiers au suivi Git :    git </w:t>
+      </w:r>
+      <w:proofErr w:type="spellStart"/>
+      <w:r>
+        <w:t>add</w:t>
+      </w:r>
+      <w:proofErr w:type="spellEnd"/>
+      <w:r>
+        <w:t xml:space="preserve"> .</w:t>
       </w:r>
     </w:p>
     <w:p>
@@ -69,7 +110,39 @@
         <w:ind w:right="1038" w:hanging="267"/>
       </w:pPr>
       <w:r>
-        <w:t>Ajouter le dépôt distant (origin) :    git remote add origin https://github.com/&lt;ton-utilisateur&gt;/&lt;nom-du-depot&gt;.git</w:t>
+        <w:t>Ajouter le dépôt distant (</w:t>
+      </w:r>
+      <w:proofErr w:type="spellStart"/>
+      <w:r>
+        <w:t>origin</w:t>
+      </w:r>
+      <w:proofErr w:type="spellEnd"/>
+      <w:r>
+        <w:t xml:space="preserve">) :    git </w:t>
+      </w:r>
+      <w:proofErr w:type="spellStart"/>
+      <w:r>
+        <w:t>remote</w:t>
+      </w:r>
+      <w:proofErr w:type="spellEnd"/>
+      <w:r>
+        <w:t xml:space="preserve"> </w:t>
+      </w:r>
+      <w:proofErr w:type="spellStart"/>
+      <w:r>
+        <w:t>add</w:t>
+      </w:r>
+      <w:proofErr w:type="spellEnd"/>
+      <w:r>
+        <w:t xml:space="preserve"> </w:t>
+      </w:r>
+      <w:proofErr w:type="spellStart"/>
+      <w:r>
+        <w:t>origin</w:t>
+      </w:r>
+      <w:proofErr w:type="spellEnd"/>
+      <w:r>
+        <w:t xml:space="preserve"> https://github.com/&lt;ton-utilisateur&gt;/&lt;nom-du-depot&gt;.git</w:t>
       </w:r>
     </w:p>
     <w:p>
@@ -82,7 +155,15 @@
         <w:ind w:right="1038" w:hanging="267"/>
       </w:pPr>
       <w:r>
-        <w:t>Augmenter la taille du buffer pour éviter l'erreur de timeout :    git config --global http.postBuffer 1048576000</w:t>
+        <w:t xml:space="preserve">Augmenter la taille du buffer pour éviter l'erreur de timeout :    git config --global </w:t>
+      </w:r>
+      <w:proofErr w:type="spellStart"/>
+      <w:r>
+        <w:t>http.postBuffer</w:t>
+      </w:r>
+      <w:proofErr w:type="spellEnd"/>
+      <w:r>
+        <w:t xml:space="preserve"> 1048576000</w:t>
       </w:r>
     </w:p>
     <w:p>
@@ -95,7 +176,23 @@
         <w:ind w:right="1038" w:hanging="267"/>
       </w:pPr>
       <w:r>
-        <w:t>Pousser la branche master et créer la liaison avec le dépôt distant :    git push --set-upstream origin master</w:t>
+        <w:t>Pousser la branche master et créer la liaison avec le dépôt distant :    git push --set-</w:t>
+      </w:r>
+      <w:proofErr w:type="spellStart"/>
+      <w:r>
+        <w:t>upstream</w:t>
+      </w:r>
+      <w:proofErr w:type="spellEnd"/>
+      <w:r>
+        <w:t xml:space="preserve"> </w:t>
+      </w:r>
+      <w:proofErr w:type="spellStart"/>
+      <w:r>
+        <w:t>origin</w:t>
+      </w:r>
+      <w:proofErr w:type="spellEnd"/>
+      <w:r>
+        <w:t xml:space="preserve"> master</w:t>
       </w:r>
     </w:p>
     <w:p>
@@ -117,7 +214,39 @@
         <w:ind w:hanging="147"/>
       </w:pPr>
       <w:r>
-        <w:t>Si 'remote origin already exists' :</w:t>
+        <w:t>Si '</w:t>
+      </w:r>
+      <w:proofErr w:type="spellStart"/>
+      <w:r>
+        <w:t>remote</w:t>
+      </w:r>
+      <w:proofErr w:type="spellEnd"/>
+      <w:r>
+        <w:t xml:space="preserve"> </w:t>
+      </w:r>
+      <w:proofErr w:type="spellStart"/>
+      <w:r>
+        <w:t>origin</w:t>
+      </w:r>
+      <w:proofErr w:type="spellEnd"/>
+      <w:r>
+        <w:t xml:space="preserve"> </w:t>
+      </w:r>
+      <w:proofErr w:type="spellStart"/>
+      <w:r>
+        <w:t>already</w:t>
+      </w:r>
+      <w:proofErr w:type="spellEnd"/>
+      <w:r>
+        <w:t xml:space="preserve"> </w:t>
+      </w:r>
+      <w:proofErr w:type="spellStart"/>
+      <w:r>
+        <w:t>exists</w:t>
+      </w:r>
+      <w:proofErr w:type="spellEnd"/>
+      <w:r>
+        <w:t>' :</w:t>
       </w:r>
     </w:p>
     <w:p>
@@ -126,7 +255,55 @@
         <w:ind w:left="-5"/>
       </w:pPr>
       <w:r>
-        <w:t xml:space="preserve">   git remote remove origin    git remote add origin </w:t>
+        <w:t xml:space="preserve">   git </w:t>
+      </w:r>
+      <w:proofErr w:type="spellStart"/>
+      <w:r>
+        <w:t>remote</w:t>
+      </w:r>
+      <w:proofErr w:type="spellEnd"/>
+      <w:r>
+        <w:t xml:space="preserve"> </w:t>
+      </w:r>
+      <w:proofErr w:type="spellStart"/>
+      <w:r>
+        <w:t>remove</w:t>
+      </w:r>
+      <w:proofErr w:type="spellEnd"/>
+      <w:r>
+        <w:t xml:space="preserve"> </w:t>
+      </w:r>
+      <w:proofErr w:type="spellStart"/>
+      <w:r>
+        <w:t>origin</w:t>
+      </w:r>
+      <w:proofErr w:type="spellEnd"/>
+      <w:r>
+        <w:t xml:space="preserve">    git </w:t>
+      </w:r>
+      <w:proofErr w:type="spellStart"/>
+      <w:r>
+        <w:t>remote</w:t>
+      </w:r>
+      <w:proofErr w:type="spellEnd"/>
+      <w:r>
+        <w:t xml:space="preserve"> </w:t>
+      </w:r>
+      <w:proofErr w:type="spellStart"/>
+      <w:r>
+        <w:t>add</w:t>
+      </w:r>
+      <w:proofErr w:type="spellEnd"/>
+      <w:r>
+        <w:t xml:space="preserve"> </w:t>
+      </w:r>
+      <w:proofErr w:type="spellStart"/>
+      <w:r>
+        <w:t>origin</w:t>
+      </w:r>
+      <w:proofErr w:type="spellEnd"/>
+      <w:r>
+        <w:t xml:space="preserve"> </w:t>
       </w:r>
       <w:hyperlink r:id="rId5" w:history="1">
         <w:r>
@@ -143,7 +320,16 @@
         <w:ind w:left="-5"/>
       </w:pPr>
       <w:r>
-        <w:t>pour faire revenire le code, il faut le pull</w:t>
+        <w:lastRenderedPageBreak/>
+        <w:t xml:space="preserve">pour faire </w:t>
+      </w:r>
+      <w:proofErr w:type="spellStart"/>
+      <w:r>
+        <w:t>revenire</w:t>
+      </w:r>
+      <w:proofErr w:type="spellEnd"/>
+      <w:r>
+        <w:t xml:space="preserve"> le code, il faut le pull</w:t>
       </w:r>
     </w:p>
     <w:p>
@@ -152,8 +338,15 @@
         <w:ind w:left="-5"/>
       </w:pPr>
       <w:r>
-        <w:lastRenderedPageBreak/>
-        <w:t>git pull origin master</w:t>
+        <w:t xml:space="preserve">git pull </w:t>
+      </w:r>
+      <w:proofErr w:type="spellStart"/>
+      <w:r>
+        <w:t>origin</w:t>
+      </w:r>
+      <w:proofErr w:type="spellEnd"/>
+      <w:r>
+        <w:t xml:space="preserve"> master</w:t>
       </w:r>
     </w:p>
     <w:p>
@@ -165,7 +358,23 @@
         <w:ind w:hanging="147"/>
       </w:pPr>
       <w:r>
-        <w:t>Si 'Permission denied (publickey)' :</w:t>
+        <w:t xml:space="preserve">Si 'Permission </w:t>
+      </w:r>
+      <w:proofErr w:type="spellStart"/>
+      <w:r>
+        <w:t>denied</w:t>
+      </w:r>
+      <w:proofErr w:type="spellEnd"/>
+      <w:r>
+        <w:t xml:space="preserve"> (</w:t>
+      </w:r>
+      <w:proofErr w:type="spellStart"/>
+      <w:r>
+        <w:t>publickey</w:t>
+      </w:r>
+      <w:proofErr w:type="spellEnd"/>
+      <w:r>
+        <w:t>)' :</w:t>
       </w:r>
     </w:p>
     <w:p>
@@ -233,8 +442,13 @@
       <w:pPr>
         <w:ind w:left="0" w:firstLine="0"/>
       </w:pPr>
-      <w:r>
-        <w:t>pip freeze &gt; requirements.txt</w:t>
+      <w:proofErr w:type="spellStart"/>
+      <w:r>
+        <w:t>pip</w:t>
+      </w:r>
+      <w:proofErr w:type="spellEnd"/>
+      <w:r>
+        <w:t xml:space="preserve"> freeze &gt; requirements.txt</w:t>
       </w:r>
     </w:p>
     <w:p>
@@ -281,8 +495,13 @@
       <w:pPr>
         <w:ind w:left="0" w:firstLine="0"/>
       </w:pPr>
-      <w:r>
-        <w:t>dir requirements.txt</w:t>
+      <w:proofErr w:type="spellStart"/>
+      <w:r>
+        <w:t>dir</w:t>
+      </w:r>
+      <w:proofErr w:type="spellEnd"/>
+      <w:r>
+        <w:t xml:space="preserve"> requirements.txt</w:t>
       </w:r>
     </w:p>
     <w:p>
@@ -316,24 +535,48 @@
         <w:ind w:left="0" w:firstLine="0"/>
       </w:pPr>
       <w:r>
-        <w:t>git add requirements.txt</w:t>
-      </w:r>
-    </w:p>
-    <w:p>
-      <w:pPr>
-        <w:ind w:left="-5"/>
-      </w:pPr>
-      <w:r>
         <w:lastRenderedPageBreak/>
-        <w:t>git commit -m "Ajout des dépendances avec pip freeze"</w:t>
-      </w:r>
-    </w:p>
-    <w:p>
-      <w:pPr>
-        <w:ind w:left="-5"/>
-      </w:pPr>
-      <w:r>
-        <w:t>git push origin master</w:t>
+        <w:t xml:space="preserve">git </w:t>
+      </w:r>
+      <w:proofErr w:type="spellStart"/>
+      <w:r>
+        <w:t>add</w:t>
+      </w:r>
+      <w:proofErr w:type="spellEnd"/>
+      <w:r>
+        <w:t xml:space="preserve"> requirements.txt</w:t>
+      </w:r>
+    </w:p>
+    <w:p>
+      <w:pPr>
+        <w:ind w:left="-5"/>
+      </w:pPr>
+      <w:r>
+        <w:t xml:space="preserve">git commit -m "Ajout des dépendances avec </w:t>
+      </w:r>
+      <w:proofErr w:type="spellStart"/>
+      <w:r>
+        <w:t>pip</w:t>
+      </w:r>
+      <w:proofErr w:type="spellEnd"/>
+      <w:r>
+        <w:t xml:space="preserve"> freeze"</w:t>
+      </w:r>
+    </w:p>
+    <w:p>
+      <w:pPr>
+        <w:ind w:left="-5"/>
+      </w:pPr>
+      <w:r>
+        <w:t xml:space="preserve">git push </w:t>
+      </w:r>
+      <w:proofErr w:type="spellStart"/>
+      <w:r>
+        <w:t>origin</w:t>
+      </w:r>
+      <w:proofErr w:type="spellEnd"/>
+      <w:r>
+        <w:t xml:space="preserve"> master</w:t>
       </w:r>
     </w:p>
     <w:p>
@@ -348,20 +591,40 @@
       <w:pPr>
         <w:ind w:left="-5"/>
       </w:pPr>
-      <w:r>
-        <w:t>pg_dump -U postgres -h localhost -p 5432 -F c -b -v -f</w:t>
+      <w:proofErr w:type="spellStart"/>
+      <w:r>
+        <w:t>pg_dump</w:t>
+      </w:r>
+      <w:proofErr w:type="spellEnd"/>
+      <w:r>
+        <w:t xml:space="preserve"> -U </w:t>
+      </w:r>
+      <w:proofErr w:type="spellStart"/>
+      <w:r>
+        <w:t>postgres</w:t>
+      </w:r>
+      <w:proofErr w:type="spellEnd"/>
+      <w:r>
+        <w:t xml:space="preserve"> -h localhost -p 5432 -F c -b -v -f</w:t>
       </w:r>
       <w:r>
         <w:t xml:space="preserve"> </w:t>
       </w:r>
-      <w:r>
-        <w:t xml:space="preserve">geoimmo_backup.dump </w:t>
+      <w:proofErr w:type="spellStart"/>
+      <w:r>
+        <w:t>geoimmo_backup.dump</w:t>
+      </w:r>
+      <w:proofErr w:type="spellEnd"/>
+      <w:r>
+        <w:t xml:space="preserve"> </w:t>
       </w:r>
       <w:commentRangeStart w:id="0"/>
+      <w:proofErr w:type="spellStart"/>
       <w:r>
         <w:t>geoimmo_db</w:t>
       </w:r>
       <w:commentRangeEnd w:id="0"/>
+      <w:proofErr w:type="spellEnd"/>
       <w:r>
         <w:rPr>
           <w:rStyle w:val="Marquedecommentaire"/>
@@ -387,9 +650,35 @@
       <w:pPr>
         <w:ind w:left="-5"/>
       </w:pPr>
-      <w:r>
-        <w:t>pg_restore -U postgres -h localhost -p 5432 -d dccf_tes -v geoportail.dump</w:t>
-      </w:r>
+      <w:proofErr w:type="spellStart"/>
+      <w:r>
+        <w:t>pg_restore</w:t>
+      </w:r>
+      <w:proofErr w:type="spellEnd"/>
+      <w:r>
+        <w:t xml:space="preserve"> -U </w:t>
+      </w:r>
+      <w:proofErr w:type="spellStart"/>
+      <w:r>
+        <w:t>postgres</w:t>
+      </w:r>
+      <w:proofErr w:type="spellEnd"/>
+      <w:r>
+        <w:t xml:space="preserve"> -h localhost -p 5432 -d </w:t>
+      </w:r>
+      <w:proofErr w:type="spellStart"/>
+      <w:r>
+        <w:t>dccf_tes</w:t>
+      </w:r>
+      <w:proofErr w:type="spellEnd"/>
+      <w:r>
+        <w:t xml:space="preserve"> -v </w:t>
+      </w:r>
+      <w:proofErr w:type="spellStart"/>
+      <w:r>
+        <w:t>geoportail.dump</w:t>
+      </w:r>
+      <w:proofErr w:type="spellEnd"/>
     </w:p>
     <w:p>
       <w:pPr>
@@ -402,7 +691,15 @@
         <w:t>redémarrer</w:t>
       </w:r>
       <w:r>
-        <w:t xml:space="preserve"> le serveur postgres </w:t>
+        <w:t xml:space="preserve"> le serveur </w:t>
+      </w:r>
+      <w:proofErr w:type="spellStart"/>
+      <w:r>
+        <w:t>postgres</w:t>
+      </w:r>
+      <w:proofErr w:type="spellEnd"/>
+      <w:r>
+        <w:t xml:space="preserve"> </w:t>
       </w:r>
     </w:p>
     <w:p>
@@ -433,9 +730,11 @@
       <w:pPr>
         <w:ind w:left="-5"/>
       </w:pPr>
+      <w:proofErr w:type="spellStart"/>
       <w:r>
         <w:t>wf.msc</w:t>
       </w:r>
+      <w:proofErr w:type="spellEnd"/>
     </w:p>
     <w:p>
       <w:pPr>
@@ -533,16 +832,18 @@
       <w:pPr>
         <w:ind w:left="-5"/>
       </w:pPr>
-      <w:r>
+      <w:proofErr w:type="spellStart"/>
+      <w:r>
+        <w:lastRenderedPageBreak/>
         <w:t>yaml</w:t>
       </w:r>
-    </w:p>
-    <w:p>
-      <w:pPr>
-        <w:ind w:left="-5"/>
-      </w:pPr>
-      <w:r>
-        <w:lastRenderedPageBreak/>
+      <w:proofErr w:type="spellEnd"/>
+    </w:p>
+    <w:p>
+      <w:pPr>
+        <w:ind w:left="-5"/>
+      </w:pPr>
+      <w:r>
         <w:t>PostgreSQL - Port 5432</w:t>
       </w:r>
     </w:p>

</xml_diff>